<commit_message>
Add one-page thesis proposal for the director (#1)
- thesis/propuesta.qmd: purpose, RQ1-RQ5, two-period design, scope; renders
  to thesis/_output/propuesta.docx with the UANL reference document
- reference.docx: Title/Subtitle/Author/Date styles (black Arial, centered)

Co-Authored-By: Claude Opus 5.5 <noreply@anthropic.com>
</commit_message>
<xml_diff>
--- a/thesis/templates/reference.docx
+++ b/thesis/templates/reference.docx
@@ -2475,17 +2475,22 @@
   <w:style w:type="paragraph" w:styleId="Title">
     <w:name w:val="Title"/>
     <w:basedOn w:val="Normal"/>
-    <w:next w:val="Normal"/>
     <w:uiPriority w:val="10"/>
     <w:qFormat/>
     <w:pPr>
       <w:keepNext/>
       <w:keepLines/>
-      <w:spacing w:after="60"/>
+      <w:spacing w:before="0" w:after="120" w:line="240" w:lineRule="auto"/>
+      <w:ind w:firstLine="0"/>
+      <w:jc w:val="center"/>
     </w:pPr>
     <w:rPr>
-      <w:sz w:val="52"/>
-      <w:szCs w:val="52"/>
+      <w:rFonts w:ascii="Arial" w:hAnsi="Arial" w:eastAsia="Arial" w:cs="Arial"/>
+      <w:b/>
+      <w:bCs/>
+      <w:color w:val="000000"/>
+      <w:sz w:val="26"/>
+      <w:szCs w:val="26"/>
     </w:rPr>
   </w:style>
   <w:style w:type="paragraph" w:styleId="Header">
@@ -2628,19 +2633,23 @@
   </w:style>
   <w:style w:type="paragraph" w:styleId="Subtitle">
     <w:name w:val="Subtitle"/>
-    <w:basedOn w:val="Normal"/>
-    <w:next w:val="Normal"/>
+    <w:basedOn w:val="Title"/>
     <w:uiPriority w:val="11"/>
     <w:qFormat/>
     <w:pPr>
       <w:keepNext/>
       <w:keepLines/>
-      <w:spacing w:after="320"/>
+      <w:spacing w:before="0" w:after="120" w:line="240" w:lineRule="auto"/>
+      <w:ind w:firstLine="0"/>
+      <w:jc w:val="center"/>
     </w:pPr>
     <w:rPr>
-      <w:color w:val="666666"/>
-      <w:sz w:val="30"/>
-      <w:szCs w:val="30"/>
+      <w:rFonts w:ascii="Arial" w:hAnsi="Arial" w:eastAsia="Arial" w:cs="Arial"/>
+      <w:i/>
+      <w:iCs/>
+      <w:color w:val="000000"/>
+      <w:sz w:val="22"/>
+      <w:szCs w:val="22"/>
     </w:rPr>
   </w:style>
   <w:style w:type="paragraph" w:styleId="NoSpacing">
@@ -2755,6 +2764,40 @@
       <w:rFonts w:ascii="Arial" w:hAnsi="Arial" w:eastAsia="Arial" w:cs="Arial"/>
       <w:b/>
       <w:bCs/>
+      <w:color w:val="000000"/>
+      <w:sz w:val="22"/>
+      <w:szCs w:val="22"/>
+    </w:rPr>
+  </w:style>
+  <w:style w:type="paragraph" w:customStyle="1" w:styleId="Author">
+    <w:name w:val="Author"/>
+    <w:basedOn w:val="Normal"/>
+    <w:pPr>
+      <w:keepNext/>
+      <w:keepLines/>
+      <w:spacing w:before="0" w:after="60" w:line="240" w:lineRule="auto"/>
+      <w:ind w:firstLine="0"/>
+      <w:jc w:val="center"/>
+    </w:pPr>
+    <w:rPr>
+      <w:rFonts w:ascii="Arial" w:hAnsi="Arial" w:eastAsia="Arial" w:cs="Arial"/>
+      <w:color w:val="000000"/>
+      <w:sz w:val="22"/>
+      <w:szCs w:val="22"/>
+    </w:rPr>
+  </w:style>
+  <w:style w:type="paragraph" w:customStyle="1" w:styleId="Date">
+    <w:name w:val="Date"/>
+    <w:basedOn w:val="Normal"/>
+    <w:pPr>
+      <w:keepNext/>
+      <w:keepLines/>
+      <w:spacing w:before="0" w:after="60" w:line="240" w:lineRule="auto"/>
+      <w:ind w:firstLine="0"/>
+      <w:jc w:val="center"/>
+    </w:pPr>
+    <w:rPr>
+      <w:rFonts w:ascii="Arial" w:hAnsi="Arial" w:eastAsia="Arial" w:cs="Arial"/>
       <w:color w:val="000000"/>
       <w:sz w:val="22"/>
       <w:szCs w:val="22"/>

</xml_diff>